<commit_message>
Durably restage corrected Manual 04 publication package
</commit_message>
<xml_diff>
--- a/01-foundations/NIST_AI_600-1_Generative_AI_Profile/publication/Manual_04_NIST_AI_600-1_Generative_AI_Profile_EN.docx
+++ b/01-foundations/NIST_AI_600-1_Generative_AI_Profile/publication/Manual_04_NIST_AI_600-1_Generative_AI_Profile_EN.docx
@@ -41,7 +41,7 @@
           <w:sz w:val="17"/>
           <w:lang w:val="en-US"/>
         </w:rPr>
-        <w:t>Controlled source revision: 691c1aa5d01ef7395793be10195095551ace43a8 | Language: en | NIST AI 600-1 Generative AI Profile with AI RMF 1.0 parent framework; version-aware and source-watched.</w:t>
+        <w:t>Controlled source revision: 2b1e27f06c1f35ff2b95b8b528a30aae4682bd5d | Language: en | NIST AI 600-1 Generative AI Profile with AI RMF 1.0 parent framework; version-aware and source-watched.</w:t>
       </w:r>
     </w:p>
     <w:p>
@@ -5100,16 +5100,7 @@
         <w:sz w:val="16"/>
         <w:lang w:val="en-US"/>
       </w:rPr>
-      <w:t xml:space="preserve">Manual 04 | Controlled publication QA candidate | </w:t>
-    </w:r>
-    <w:fldSimple w:instr="PAGE"/>
-    <w:r>
-      <w:rPr>
-        <w:rFonts w:ascii="Arial" w:hAnsi="Arial" w:eastAsia="Arial"/>
-        <w:sz w:val="16"/>
-        <w:lang w:val="en-US"/>
-      </w:rPr>
-      <w:t xml:space="preserve">Manual 04 | Controlled publication QA candidate | </w:t>
+      <w:t xml:space="preserve">Manual 04 | CONTROLLED PUBLICATION QA CANDIDATE | </w:t>
     </w:r>
     <w:fldSimple w:instr="PAGE"/>
   </w:p>

</xml_diff>